<commit_message>
Söndagens loggbok - glömde commita den
</commit_message>
<xml_diff>
--- a/Simon Tobiasson - Loggbok - Inlämningsuppgift - Kajens cykeluthyrning.docx
+++ b/Simon Tobiasson - Loggbok - Inlämningsuppgift - Kajens cykeluthyrning.docx
@@ -4506,12 +4506,12 @@
           <wp:inline distB="114300" distT="114300" distL="114300" distR="114300">
             <wp:extent cx="5731200" cy="2489200"/>
             <wp:effectExtent b="0" l="0" r="0" t="0"/>
-            <wp:docPr id="6" name="image2.png"/>
+            <wp:docPr id="6" name="image8.png"/>
             <a:graphic>
               <a:graphicData uri="http://schemas.openxmlformats.org/drawingml/2006/picture">
                 <pic:pic>
                   <pic:nvPicPr>
-                    <pic:cNvPr id="0" name="image2.png"/>
+                    <pic:cNvPr id="0" name="image8.png"/>
                     <pic:cNvPicPr preferRelativeResize="0"/>
                   </pic:nvPicPr>
                   <pic:blipFill>
@@ -4671,12 +4671,12 @@
           <wp:inline distB="114300" distT="114300" distL="114300" distR="114300">
             <wp:extent cx="5731200" cy="4178300"/>
             <wp:effectExtent b="0" l="0" r="0" t="0"/>
-            <wp:docPr id="7" name="image6.png"/>
+            <wp:docPr id="7" name="image5.png"/>
             <a:graphic>
               <a:graphicData uri="http://schemas.openxmlformats.org/drawingml/2006/picture">
                 <pic:pic>
                   <pic:nvPicPr>
-                    <pic:cNvPr id="0" name="image6.png"/>
+                    <pic:cNvPr id="0" name="image5.png"/>
                     <pic:cNvPicPr preferRelativeResize="0"/>
                   </pic:nvPicPr>
                   <pic:blipFill>
@@ -5893,12 +5893,12 @@
           <wp:inline distB="114300" distT="114300" distL="114300" distR="114300">
             <wp:extent cx="5731200" cy="2082800"/>
             <wp:effectExtent b="0" l="0" r="0" t="0"/>
-            <wp:docPr id="5" name="image8.png"/>
+            <wp:docPr id="5" name="image9.png"/>
             <a:graphic>
               <a:graphicData uri="http://schemas.openxmlformats.org/drawingml/2006/picture">
                 <pic:pic>
                   <pic:nvPicPr>
-                    <pic:cNvPr id="0" name="image8.png"/>
+                    <pic:cNvPr id="0" name="image9.png"/>
                     <pic:cNvPicPr preferRelativeResize="0"/>
                   </pic:nvPicPr>
                   <pic:blipFill>
@@ -6020,12 +6020,12 @@
           <wp:inline distB="114300" distT="114300" distL="114300" distR="114300">
             <wp:extent cx="5731200" cy="3644900"/>
             <wp:effectExtent b="0" l="0" r="0" t="0"/>
-            <wp:docPr id="8" name="image9.png"/>
+            <wp:docPr id="8" name="image2.png"/>
             <a:graphic>
               <a:graphicData uri="http://schemas.openxmlformats.org/drawingml/2006/picture">
                 <pic:pic>
                   <pic:nvPicPr>
-                    <pic:cNvPr id="0" name="image9.png"/>
+                    <pic:cNvPr id="0" name="image2.png"/>
                     <pic:cNvPicPr preferRelativeResize="0"/>
                   </pic:nvPicPr>
                   <pic:blipFill>
@@ -6075,12 +6075,12 @@
           <wp:inline distB="114300" distT="114300" distL="114300" distR="114300">
             <wp:extent cx="3314700" cy="5486400"/>
             <wp:effectExtent b="0" l="0" r="0" t="0"/>
-            <wp:docPr id="2" name="image1.png"/>
+            <wp:docPr id="2" name="image7.png"/>
             <a:graphic>
               <a:graphicData uri="http://schemas.openxmlformats.org/drawingml/2006/picture">
                 <pic:pic>
                   <pic:nvPicPr>
-                    <pic:cNvPr id="0" name="image1.png"/>
+                    <pic:cNvPr id="0" name="image7.png"/>
                     <pic:cNvPicPr preferRelativeResize="0"/>
                   </pic:nvPicPr>
                   <pic:blipFill>
@@ -6130,12 +6130,12 @@
           <wp:inline distB="114300" distT="114300" distL="114300" distR="114300">
             <wp:extent cx="5731200" cy="1346200"/>
             <wp:effectExtent b="0" l="0" r="0" t="0"/>
-            <wp:docPr id="1" name="image5.png"/>
+            <wp:docPr id="1" name="image4.png"/>
             <a:graphic>
               <a:graphicData uri="http://schemas.openxmlformats.org/drawingml/2006/picture">
                 <pic:pic>
                   <pic:nvPicPr>
-                    <pic:cNvPr id="0" name="image5.png"/>
+                    <pic:cNvPr id="0" name="image4.png"/>
                     <pic:cNvPicPr preferRelativeResize="0"/>
                   </pic:nvPicPr>
                   <pic:blipFill>
@@ -6185,12 +6185,12 @@
           <wp:inline distB="114300" distT="114300" distL="114300" distR="114300">
             <wp:extent cx="5731200" cy="2921000"/>
             <wp:effectExtent b="0" l="0" r="0" t="0"/>
-            <wp:docPr id="9" name="image4.png"/>
+            <wp:docPr id="9" name="image6.png"/>
             <a:graphic>
               <a:graphicData uri="http://schemas.openxmlformats.org/drawingml/2006/picture">
                 <pic:pic>
                   <pic:nvPicPr>
-                    <pic:cNvPr id="0" name="image4.png"/>
+                    <pic:cNvPr id="0" name="image6.png"/>
                     <pic:cNvPicPr preferRelativeResize="0"/>
                   </pic:nvPicPr>
                   <pic:blipFill>
@@ -6377,12 +6377,12 @@
           <wp:inline distB="114300" distT="114300" distL="114300" distR="114300">
             <wp:extent cx="5731200" cy="2705100"/>
             <wp:effectExtent b="0" l="0" r="0" t="0"/>
-            <wp:docPr id="4" name="image7.png"/>
+            <wp:docPr id="4" name="image1.png"/>
             <a:graphic>
               <a:graphicData uri="http://schemas.openxmlformats.org/drawingml/2006/picture">
                 <pic:pic>
                   <pic:nvPicPr>
-                    <pic:cNvPr id="0" name="image7.png"/>
+                    <pic:cNvPr id="0" name="image1.png"/>
                     <pic:cNvPicPr preferRelativeResize="0"/>
                   </pic:nvPicPr>
                   <pic:blipFill>
@@ -9815,6 +9815,1154 @@
         </w:rPr>
         <w:t xml:space="preserve">Lördag 2026-10-24 SLUT</w:t>
       </w:r>
+    </w:p>
+    <w:p>
+      <w:pPr>
+        <w:widowControl w:val="0"/>
+        <w:spacing w:line="240" w:lineRule="auto"/>
+        <w:rPr>
+          <w:rFonts w:ascii="Times New Roman" w:cs="Times New Roman" w:eastAsia="Times New Roman" w:hAnsi="Times New Roman"/>
+          <w:b w:val="1"/>
+          <w:bCs w:val="1"/>
+          <w:sz w:val="26"/>
+          <w:szCs w:val="26"/>
+        </w:rPr>
+      </w:pPr>
+      <w:r>
+        <w:rPr>
+          <w:rtl w:val="0"/>
+        </w:rPr>
+      </w:r>
+    </w:p>
+    <w:p>
+      <w:pPr>
+        <w:widowControl w:val="0"/>
+        <w:spacing w:line="240" w:lineRule="auto"/>
+        <w:rPr>
+          <w:rFonts w:ascii="Times New Roman" w:cs="Times New Roman" w:eastAsia="Times New Roman" w:hAnsi="Times New Roman"/>
+          <w:b w:val="1"/>
+          <w:bCs w:val="1"/>
+          <w:sz w:val="26"/>
+          <w:szCs w:val="26"/>
+        </w:rPr>
+      </w:pPr>
+      <w:r>
+        <w:rPr>
+          <w:rtl w:val="0"/>
+        </w:rPr>
+      </w:r>
+    </w:p>
+    <w:p>
+      <w:pPr>
+        <w:widowControl w:val="0"/>
+        <w:spacing w:line="240" w:lineRule="auto"/>
+        <w:rPr>
+          <w:rFonts w:ascii="Times New Roman" w:cs="Times New Roman" w:eastAsia="Times New Roman" w:hAnsi="Times New Roman"/>
+          <w:b w:val="1"/>
+          <w:bCs w:val="1"/>
+          <w:sz w:val="26"/>
+          <w:szCs w:val="26"/>
+        </w:rPr>
+      </w:pPr>
+      <w:r>
+        <w:rPr>
+          <w:rtl w:val="0"/>
+        </w:rPr>
+      </w:r>
+    </w:p>
+    <w:p>
+      <w:pPr>
+        <w:widowControl w:val="0"/>
+        <w:spacing w:line="240" w:lineRule="auto"/>
+        <w:rPr>
+          <w:rFonts w:ascii="Times New Roman" w:cs="Times New Roman" w:eastAsia="Times New Roman" w:hAnsi="Times New Roman"/>
+          <w:b w:val="1"/>
+          <w:bCs w:val="1"/>
+          <w:sz w:val="28"/>
+          <w:szCs w:val="28"/>
+        </w:rPr>
+      </w:pPr>
+      <w:r>
+        <w:rPr>
+          <w:rFonts w:ascii="Times New Roman" w:cs="Times New Roman" w:eastAsia="Times New Roman" w:hAnsi="Times New Roman"/>
+          <w:b w:val="1"/>
+          <w:bCs w:val="1"/>
+          <w:sz w:val="28"/>
+          <w:szCs w:val="28"/>
+          <w:rtl w:val="0"/>
+        </w:rPr>
+        <w:t xml:space="preserve">Söndag 2026-10-25 START</w:t>
+      </w:r>
+    </w:p>
+    <w:p>
+      <w:pPr>
+        <w:widowControl w:val="0"/>
+        <w:spacing w:line="240" w:lineRule="auto"/>
+        <w:rPr>
+          <w:rFonts w:ascii="Times New Roman" w:cs="Times New Roman" w:eastAsia="Times New Roman" w:hAnsi="Times New Roman"/>
+          <w:b w:val="1"/>
+          <w:bCs w:val="1"/>
+          <w:sz w:val="28"/>
+          <w:szCs w:val="28"/>
+        </w:rPr>
+      </w:pPr>
+      <w:r>
+        <w:rPr>
+          <w:rtl w:val="0"/>
+        </w:rPr>
+      </w:r>
+    </w:p>
+    <w:p>
+      <w:pPr>
+        <w:widowControl w:val="0"/>
+        <w:spacing w:line="240" w:lineRule="auto"/>
+        <w:rPr>
+          <w:rFonts w:ascii="Times New Roman" w:cs="Times New Roman" w:eastAsia="Times New Roman" w:hAnsi="Times New Roman"/>
+          <w:b w:val="1"/>
+          <w:bCs w:val="1"/>
+          <w:sz w:val="26"/>
+          <w:szCs w:val="26"/>
+        </w:rPr>
+      </w:pPr>
+      <w:r>
+        <w:rPr>
+          <w:rFonts w:ascii="Times New Roman" w:cs="Times New Roman" w:eastAsia="Times New Roman" w:hAnsi="Times New Roman"/>
+          <w:b w:val="1"/>
+          <w:bCs w:val="1"/>
+          <w:sz w:val="26"/>
+          <w:szCs w:val="26"/>
+          <w:rtl w:val="0"/>
+        </w:rPr>
+        <w:t xml:space="preserve">Kl 12:30</w:t>
+      </w:r>
+    </w:p>
+    <w:p>
+      <w:pPr>
+        <w:widowControl w:val="0"/>
+        <w:spacing w:line="240" w:lineRule="auto"/>
+        <w:rPr>
+          <w:rFonts w:ascii="Times New Roman" w:cs="Times New Roman" w:eastAsia="Times New Roman" w:hAnsi="Times New Roman"/>
+          <w:b w:val="1"/>
+          <w:bCs w:val="1"/>
+          <w:sz w:val="26"/>
+          <w:szCs w:val="26"/>
+        </w:rPr>
+      </w:pPr>
+      <w:r>
+        <w:rPr>
+          <w:rtl w:val="0"/>
+        </w:rPr>
+      </w:r>
+    </w:p>
+    <w:p>
+      <w:pPr>
+        <w:widowControl w:val="0"/>
+        <w:spacing w:line="240" w:lineRule="auto"/>
+        <w:rPr>
+          <w:rFonts w:ascii="Times New Roman" w:cs="Times New Roman" w:eastAsia="Times New Roman" w:hAnsi="Times New Roman"/>
+          <w:sz w:val="24"/>
+          <w:szCs w:val="24"/>
+        </w:rPr>
+      </w:pPr>
+      <w:r>
+        <w:rPr>
+          <w:rFonts w:ascii="Times New Roman" w:cs="Times New Roman" w:eastAsia="Times New Roman" w:hAnsi="Times New Roman"/>
+          <w:sz w:val="24"/>
+          <w:szCs w:val="24"/>
+          <w:rtl w:val="0"/>
+        </w:rPr>
+        <w:t xml:space="preserve">Jag är för det mestadels klar med koden. Det enda som saknas nu är att utskriften ser bra ut.</w:t>
+      </w:r>
+    </w:p>
+    <w:p>
+      <w:pPr>
+        <w:widowControl w:val="0"/>
+        <w:spacing w:line="240" w:lineRule="auto"/>
+        <w:rPr>
+          <w:rFonts w:ascii="Times New Roman" w:cs="Times New Roman" w:eastAsia="Times New Roman" w:hAnsi="Times New Roman"/>
+          <w:sz w:val="24"/>
+          <w:szCs w:val="24"/>
+        </w:rPr>
+      </w:pPr>
+      <w:r>
+        <w:rPr>
+          <w:rtl w:val="0"/>
+        </w:rPr>
+      </w:r>
+    </w:p>
+    <w:p>
+      <w:pPr>
+        <w:widowControl w:val="0"/>
+        <w:spacing w:line="240" w:lineRule="auto"/>
+        <w:rPr>
+          <w:rFonts w:ascii="Times New Roman" w:cs="Times New Roman" w:eastAsia="Times New Roman" w:hAnsi="Times New Roman"/>
+          <w:b w:val="1"/>
+          <w:bCs w:val="1"/>
+          <w:sz w:val="26"/>
+          <w:szCs w:val="26"/>
+        </w:rPr>
+      </w:pPr>
+      <w:r>
+        <w:rPr>
+          <w:rFonts w:ascii="Times New Roman" w:cs="Times New Roman" w:eastAsia="Times New Roman" w:hAnsi="Times New Roman"/>
+          <w:b w:val="1"/>
+          <w:bCs w:val="1"/>
+          <w:sz w:val="26"/>
+          <w:szCs w:val="26"/>
+          <w:rtl w:val="0"/>
+        </w:rPr>
+        <w:t xml:space="preserve">Kl 13:30</w:t>
+      </w:r>
+    </w:p>
+    <w:p>
+      <w:pPr>
+        <w:widowControl w:val="0"/>
+        <w:spacing w:line="240" w:lineRule="auto"/>
+        <w:rPr>
+          <w:rFonts w:ascii="Times New Roman" w:cs="Times New Roman" w:eastAsia="Times New Roman" w:hAnsi="Times New Roman"/>
+          <w:sz w:val="24"/>
+          <w:szCs w:val="24"/>
+        </w:rPr>
+      </w:pPr>
+      <w:r>
+        <w:rPr>
+          <w:rtl w:val="0"/>
+        </w:rPr>
+      </w:r>
+    </w:p>
+    <w:p>
+      <w:pPr>
+        <w:widowControl w:val="0"/>
+        <w:spacing w:line="240" w:lineRule="auto"/>
+        <w:rPr>
+          <w:rFonts w:ascii="Times New Roman" w:cs="Times New Roman" w:eastAsia="Times New Roman" w:hAnsi="Times New Roman"/>
+          <w:sz w:val="24"/>
+          <w:szCs w:val="24"/>
+        </w:rPr>
+      </w:pPr>
+      <w:r>
+        <w:rPr>
+          <w:rFonts w:ascii="Times New Roman" w:cs="Times New Roman" w:eastAsia="Times New Roman" w:hAnsi="Times New Roman"/>
+          <w:sz w:val="24"/>
+          <w:szCs w:val="24"/>
+          <w:rtl w:val="0"/>
+        </w:rPr>
+        <w:t xml:space="preserve">Hittade ett felbeteende som jag skulle ha fixat innan men glömde av. När användaren är i alternativ 3 och försöker hyra ut en cykel med för lite batterinivå kommer prompten att skriva in antal timmar innan programmet går tillbaka till menyn. </w:t>
+      </w:r>
+    </w:p>
+    <w:p>
+      <w:pPr>
+        <w:widowControl w:val="0"/>
+        <w:spacing w:line="240" w:lineRule="auto"/>
+        <w:rPr>
+          <w:rFonts w:ascii="Times New Roman" w:cs="Times New Roman" w:eastAsia="Times New Roman" w:hAnsi="Times New Roman"/>
+          <w:sz w:val="24"/>
+          <w:szCs w:val="24"/>
+        </w:rPr>
+      </w:pPr>
+      <w:r>
+        <w:rPr>
+          <w:rtl w:val="0"/>
+        </w:rPr>
+      </w:r>
+    </w:p>
+    <w:p>
+      <w:pPr>
+        <w:widowControl w:val="0"/>
+        <w:spacing w:line="240" w:lineRule="auto"/>
+        <w:rPr>
+          <w:rFonts w:ascii="Times New Roman" w:cs="Times New Roman" w:eastAsia="Times New Roman" w:hAnsi="Times New Roman"/>
+          <w:b w:val="1"/>
+          <w:bCs w:val="1"/>
+          <w:sz w:val="26"/>
+          <w:szCs w:val="26"/>
+        </w:rPr>
+      </w:pPr>
+      <w:r>
+        <w:rPr>
+          <w:rFonts w:ascii="Times New Roman" w:cs="Times New Roman" w:eastAsia="Times New Roman" w:hAnsi="Times New Roman"/>
+          <w:b w:val="1"/>
+          <w:bCs w:val="1"/>
+          <w:sz w:val="26"/>
+          <w:szCs w:val="26"/>
+          <w:rtl w:val="0"/>
+        </w:rPr>
+        <w:t xml:space="preserve">Kl 14:10</w:t>
+      </w:r>
+    </w:p>
+    <w:p>
+      <w:pPr>
+        <w:widowControl w:val="0"/>
+        <w:spacing w:line="240" w:lineRule="auto"/>
+        <w:rPr>
+          <w:rFonts w:ascii="Times New Roman" w:cs="Times New Roman" w:eastAsia="Times New Roman" w:hAnsi="Times New Roman"/>
+          <w:b w:val="1"/>
+          <w:bCs w:val="1"/>
+          <w:sz w:val="26"/>
+          <w:szCs w:val="26"/>
+        </w:rPr>
+      </w:pPr>
+      <w:r>
+        <w:rPr>
+          <w:rtl w:val="0"/>
+        </w:rPr>
+      </w:r>
+    </w:p>
+    <w:p>
+      <w:pPr>
+        <w:widowControl w:val="0"/>
+        <w:spacing w:line="240" w:lineRule="auto"/>
+        <w:rPr>
+          <w:rFonts w:ascii="Times New Roman" w:cs="Times New Roman" w:eastAsia="Times New Roman" w:hAnsi="Times New Roman"/>
+          <w:sz w:val="24"/>
+          <w:szCs w:val="24"/>
+        </w:rPr>
+      </w:pPr>
+      <w:r>
+        <w:rPr>
+          <w:rFonts w:ascii="Times New Roman" w:cs="Times New Roman" w:eastAsia="Times New Roman" w:hAnsi="Times New Roman"/>
+          <w:sz w:val="24"/>
+          <w:szCs w:val="24"/>
+          <w:rtl w:val="0"/>
+        </w:rPr>
+        <w:t xml:space="preserve">Problemet löste sig efter 40 minuter. Lösning jag kom fram till var att strukturera om Uthyrning - VäljFordon metoden att först kolla om KanHyrasUt går igenom och ge meddelanderna där vilket gjorde att jag behövde ändra meddelanderna från “Cykelnummer x hyrs ut” till “</w:t>
+      </w:r>
+      <w:r>
+        <w:rPr>
+          <w:rFonts w:ascii="Times New Roman" w:cs="Times New Roman" w:eastAsia="Times New Roman" w:hAnsi="Times New Roman"/>
+          <w:color w:val="a31515"/>
+          <w:sz w:val="18"/>
+          <w:szCs w:val="18"/>
+          <w:rtl w:val="0"/>
+        </w:rPr>
+        <w:t xml:space="preserve">Cykelnummer </w:t>
+      </w:r>
+      <w:r>
+        <w:rPr>
+          <w:rFonts w:ascii="Times New Roman" w:cs="Times New Roman" w:eastAsia="Times New Roman" w:hAnsi="Times New Roman"/>
+          <w:sz w:val="18"/>
+          <w:szCs w:val="18"/>
+          <w:rtl w:val="0"/>
+        </w:rPr>
+        <w:t xml:space="preserve">{CykelNummer}</w:t>
+      </w:r>
+      <w:r>
+        <w:rPr>
+          <w:rFonts w:ascii="Times New Roman" w:cs="Times New Roman" w:eastAsia="Times New Roman" w:hAnsi="Times New Roman"/>
+          <w:color w:val="a31515"/>
+          <w:sz w:val="18"/>
+          <w:szCs w:val="18"/>
+          <w:rtl w:val="0"/>
+        </w:rPr>
+        <w:t xml:space="preserve"> går att hyra i max </w:t>
+      </w:r>
+      <w:r>
+        <w:rPr>
+          <w:rFonts w:ascii="Times New Roman" w:cs="Times New Roman" w:eastAsia="Times New Roman" w:hAnsi="Times New Roman"/>
+          <w:sz w:val="18"/>
+          <w:szCs w:val="18"/>
+          <w:rtl w:val="0"/>
+        </w:rPr>
+        <w:t xml:space="preserve">{BatteriNivå / 10}</w:t>
+      </w:r>
+      <w:r>
+        <w:rPr>
+          <w:rFonts w:ascii="Times New Roman" w:cs="Times New Roman" w:eastAsia="Times New Roman" w:hAnsi="Times New Roman"/>
+          <w:color w:val="a31515"/>
+          <w:sz w:val="18"/>
+          <w:szCs w:val="18"/>
+          <w:rtl w:val="0"/>
+        </w:rPr>
+        <w:t xml:space="preserve"> timmar.</w:t>
+      </w:r>
+      <w:r>
+        <w:rPr>
+          <w:rFonts w:ascii="Times New Roman" w:cs="Times New Roman" w:eastAsia="Times New Roman" w:hAnsi="Times New Roman"/>
+          <w:sz w:val="24"/>
+          <w:szCs w:val="24"/>
+          <w:rtl w:val="0"/>
+        </w:rPr>
+        <w:t xml:space="preserve">” för elcyklar och “</w:t>
+      </w:r>
+      <w:r>
+        <w:rPr>
+          <w:rFonts w:ascii="Times New Roman" w:cs="Times New Roman" w:eastAsia="Times New Roman" w:hAnsi="Times New Roman"/>
+          <w:color w:val="a31515"/>
+          <w:sz w:val="18"/>
+          <w:szCs w:val="18"/>
+          <w:rtl w:val="0"/>
+        </w:rPr>
+        <w:t xml:space="preserve">Cykelnummer </w:t>
+      </w:r>
+      <w:r>
+        <w:rPr>
+          <w:rFonts w:ascii="Times New Roman" w:cs="Times New Roman" w:eastAsia="Times New Roman" w:hAnsi="Times New Roman"/>
+          <w:sz w:val="18"/>
+          <w:szCs w:val="18"/>
+          <w:rtl w:val="0"/>
+        </w:rPr>
+        <w:t xml:space="preserve">{CykelNummer}</w:t>
+      </w:r>
+      <w:r>
+        <w:rPr>
+          <w:rFonts w:ascii="Times New Roman" w:cs="Times New Roman" w:eastAsia="Times New Roman" w:hAnsi="Times New Roman"/>
+          <w:color w:val="a31515"/>
+          <w:sz w:val="18"/>
+          <w:szCs w:val="18"/>
+          <w:rtl w:val="0"/>
+        </w:rPr>
+        <w:t xml:space="preserve"> kan hyras ut.</w:t>
+      </w:r>
+      <w:r>
+        <w:rPr>
+          <w:rFonts w:ascii="Times New Roman" w:cs="Times New Roman" w:eastAsia="Times New Roman" w:hAnsi="Times New Roman"/>
+          <w:sz w:val="24"/>
+          <w:szCs w:val="24"/>
+          <w:rtl w:val="0"/>
+        </w:rPr>
+        <w:t xml:space="preserve">”  för cyklar.</w:t>
+      </w:r>
+    </w:p>
+    <w:p>
+      <w:pPr>
+        <w:widowControl w:val="0"/>
+        <w:spacing w:line="240" w:lineRule="auto"/>
+        <w:rPr>
+          <w:rFonts w:ascii="Times New Roman" w:cs="Times New Roman" w:eastAsia="Times New Roman" w:hAnsi="Times New Roman"/>
+          <w:sz w:val="24"/>
+          <w:szCs w:val="24"/>
+        </w:rPr>
+      </w:pPr>
+      <w:r>
+        <w:rPr>
+          <w:rtl w:val="0"/>
+        </w:rPr>
+      </w:r>
+    </w:p>
+    <w:p>
+      <w:pPr>
+        <w:widowControl w:val="0"/>
+        <w:spacing w:line="240" w:lineRule="auto"/>
+        <w:rPr>
+          <w:rFonts w:ascii="Times New Roman" w:cs="Times New Roman" w:eastAsia="Times New Roman" w:hAnsi="Times New Roman"/>
+          <w:sz w:val="24"/>
+          <w:szCs w:val="24"/>
+        </w:rPr>
+      </w:pPr>
+      <w:r>
+        <w:rPr>
+          <w:rtl w:val="0"/>
+        </w:rPr>
+      </w:r>
+    </w:p>
+    <w:p>
+      <w:pPr>
+        <w:widowControl w:val="0"/>
+        <w:spacing w:line="240" w:lineRule="auto"/>
+        <w:rPr>
+          <w:rFonts w:ascii="Times New Roman" w:cs="Times New Roman" w:eastAsia="Times New Roman" w:hAnsi="Times New Roman"/>
+          <w:sz w:val="24"/>
+          <w:szCs w:val="24"/>
+        </w:rPr>
+      </w:pPr>
+      <w:r>
+        <w:rPr>
+          <w:rFonts w:ascii="Times New Roman" w:cs="Times New Roman" w:eastAsia="Times New Roman" w:hAnsi="Times New Roman"/>
+          <w:sz w:val="24"/>
+          <w:szCs w:val="24"/>
+          <w:rtl w:val="0"/>
+        </w:rPr>
+        <w:t xml:space="preserve">Det andra problemet var att programmet kunde krascha om användaren inte inmatar ett heltal i huvudmenyn. Detta är nu fixat.</w:t>
+      </w:r>
+    </w:p>
+    <w:p>
+      <w:pPr>
+        <w:widowControl w:val="0"/>
+        <w:spacing w:line="240" w:lineRule="auto"/>
+        <w:rPr>
+          <w:rFonts w:ascii="Times New Roman" w:cs="Times New Roman" w:eastAsia="Times New Roman" w:hAnsi="Times New Roman"/>
+          <w:sz w:val="24"/>
+          <w:szCs w:val="24"/>
+        </w:rPr>
+      </w:pPr>
+      <w:r>
+        <w:rPr>
+          <w:rtl w:val="0"/>
+        </w:rPr>
+      </w:r>
+    </w:p>
+    <w:p>
+      <w:pPr>
+        <w:widowControl w:val="0"/>
+        <w:spacing w:line="240" w:lineRule="auto"/>
+        <w:rPr>
+          <w:rFonts w:ascii="Times New Roman" w:cs="Times New Roman" w:eastAsia="Times New Roman" w:hAnsi="Times New Roman"/>
+          <w:sz w:val="24"/>
+          <w:szCs w:val="24"/>
+        </w:rPr>
+      </w:pPr>
+      <w:r>
+        <w:rPr>
+          <w:rtl w:val="0"/>
+        </w:rPr>
+      </w:r>
+    </w:p>
+    <w:p>
+      <w:pPr>
+        <w:widowControl w:val="0"/>
+        <w:spacing w:line="240" w:lineRule="auto"/>
+        <w:rPr>
+          <w:rFonts w:ascii="Times New Roman" w:cs="Times New Roman" w:eastAsia="Times New Roman" w:hAnsi="Times New Roman"/>
+          <w:b w:val="1"/>
+          <w:bCs w:val="1"/>
+          <w:sz w:val="26"/>
+          <w:szCs w:val="26"/>
+        </w:rPr>
+      </w:pPr>
+      <w:r>
+        <w:rPr>
+          <w:rFonts w:ascii="Times New Roman" w:cs="Times New Roman" w:eastAsia="Times New Roman" w:hAnsi="Times New Roman"/>
+          <w:b w:val="1"/>
+          <w:bCs w:val="1"/>
+          <w:sz w:val="26"/>
+          <w:szCs w:val="26"/>
+          <w:rtl w:val="0"/>
+        </w:rPr>
+        <w:t xml:space="preserve">Kl 14:30</w:t>
+      </w:r>
+    </w:p>
+    <w:p>
+      <w:pPr>
+        <w:widowControl w:val="0"/>
+        <w:spacing w:line="240" w:lineRule="auto"/>
+        <w:rPr>
+          <w:rFonts w:ascii="Times New Roman" w:cs="Times New Roman" w:eastAsia="Times New Roman" w:hAnsi="Times New Roman"/>
+          <w:b w:val="1"/>
+          <w:bCs w:val="1"/>
+          <w:sz w:val="26"/>
+          <w:szCs w:val="26"/>
+        </w:rPr>
+      </w:pPr>
+      <w:r>
+        <w:rPr>
+          <w:rtl w:val="0"/>
+        </w:rPr>
+      </w:r>
+    </w:p>
+    <w:p>
+      <w:pPr>
+        <w:widowControl w:val="0"/>
+        <w:spacing w:line="240" w:lineRule="auto"/>
+        <w:rPr>
+          <w:rFonts w:ascii="Times New Roman" w:cs="Times New Roman" w:eastAsia="Times New Roman" w:hAnsi="Times New Roman"/>
+          <w:sz w:val="24"/>
+          <w:szCs w:val="24"/>
+        </w:rPr>
+      </w:pPr>
+      <w:r>
+        <w:rPr>
+          <w:rFonts w:ascii="Times New Roman" w:cs="Times New Roman" w:eastAsia="Times New Roman" w:hAnsi="Times New Roman"/>
+          <w:sz w:val="24"/>
+          <w:szCs w:val="24"/>
+          <w:rtl w:val="0"/>
+        </w:rPr>
+        <w:t xml:space="preserve">När jag kollar igenom programmet för radbrytningar i utskriften märkte jag av att jag har inte fixat utskriften för cykelnummer i lämna tillbaka. Det står fortfarande 0.</w:t>
+      </w:r>
+    </w:p>
+    <w:p>
+      <w:pPr>
+        <w:widowControl w:val="0"/>
+        <w:spacing w:line="240" w:lineRule="auto"/>
+        <w:rPr>
+          <w:rFonts w:ascii="Times New Roman" w:cs="Times New Roman" w:eastAsia="Times New Roman" w:hAnsi="Times New Roman"/>
+          <w:sz w:val="24"/>
+          <w:szCs w:val="24"/>
+        </w:rPr>
+      </w:pPr>
+      <w:r>
+        <w:rPr>
+          <w:rtl w:val="0"/>
+        </w:rPr>
+      </w:r>
+    </w:p>
+    <w:p>
+      <w:pPr>
+        <w:widowControl w:val="0"/>
+        <w:spacing w:line="240" w:lineRule="auto"/>
+        <w:rPr>
+          <w:rFonts w:ascii="Times New Roman" w:cs="Times New Roman" w:eastAsia="Times New Roman" w:hAnsi="Times New Roman"/>
+          <w:sz w:val="24"/>
+          <w:szCs w:val="24"/>
+        </w:rPr>
+      </w:pPr>
+      <w:r>
+        <w:rPr>
+          <w:rFonts w:ascii="Times New Roman" w:cs="Times New Roman" w:eastAsia="Times New Roman" w:hAnsi="Times New Roman"/>
+          <w:sz w:val="24"/>
+          <w:szCs w:val="24"/>
+          <w:rtl w:val="0"/>
+        </w:rPr>
+        <w:t xml:space="preserve">Vad vill du göra?</w:t>
+      </w:r>
+    </w:p>
+    <w:p>
+      <w:pPr>
+        <w:widowControl w:val="0"/>
+        <w:spacing w:line="240" w:lineRule="auto"/>
+        <w:rPr>
+          <w:rFonts w:ascii="Times New Roman" w:cs="Times New Roman" w:eastAsia="Times New Roman" w:hAnsi="Times New Roman"/>
+          <w:sz w:val="24"/>
+          <w:szCs w:val="24"/>
+        </w:rPr>
+      </w:pPr>
+      <w:r>
+        <w:rPr>
+          <w:rFonts w:ascii="Times New Roman" w:cs="Times New Roman" w:eastAsia="Times New Roman" w:hAnsi="Times New Roman"/>
+          <w:sz w:val="24"/>
+          <w:szCs w:val="24"/>
+          <w:rtl w:val="0"/>
+        </w:rPr>
+        <w:t xml:space="preserve">1. Visa fordon</w:t>
+      </w:r>
+    </w:p>
+    <w:p>
+      <w:pPr>
+        <w:widowControl w:val="0"/>
+        <w:spacing w:line="240" w:lineRule="auto"/>
+        <w:rPr>
+          <w:rFonts w:ascii="Times New Roman" w:cs="Times New Roman" w:eastAsia="Times New Roman" w:hAnsi="Times New Roman"/>
+          <w:sz w:val="24"/>
+          <w:szCs w:val="24"/>
+        </w:rPr>
+      </w:pPr>
+      <w:r>
+        <w:rPr>
+          <w:rFonts w:ascii="Times New Roman" w:cs="Times New Roman" w:eastAsia="Times New Roman" w:hAnsi="Times New Roman"/>
+          <w:sz w:val="24"/>
+          <w:szCs w:val="24"/>
+          <w:rtl w:val="0"/>
+        </w:rPr>
+        <w:t xml:space="preserve">2. Lägg till kund</w:t>
+      </w:r>
+    </w:p>
+    <w:p>
+      <w:pPr>
+        <w:widowControl w:val="0"/>
+        <w:spacing w:line="240" w:lineRule="auto"/>
+        <w:rPr>
+          <w:rFonts w:ascii="Times New Roman" w:cs="Times New Roman" w:eastAsia="Times New Roman" w:hAnsi="Times New Roman"/>
+          <w:sz w:val="24"/>
+          <w:szCs w:val="24"/>
+        </w:rPr>
+      </w:pPr>
+      <w:r>
+        <w:rPr>
+          <w:rFonts w:ascii="Times New Roman" w:cs="Times New Roman" w:eastAsia="Times New Roman" w:hAnsi="Times New Roman"/>
+          <w:sz w:val="24"/>
+          <w:szCs w:val="24"/>
+          <w:rtl w:val="0"/>
+        </w:rPr>
+        <w:t xml:space="preserve">3. Hyr ut cykel</w:t>
+      </w:r>
+    </w:p>
+    <w:p>
+      <w:pPr>
+        <w:widowControl w:val="0"/>
+        <w:spacing w:line="240" w:lineRule="auto"/>
+        <w:rPr>
+          <w:rFonts w:ascii="Times New Roman" w:cs="Times New Roman" w:eastAsia="Times New Roman" w:hAnsi="Times New Roman"/>
+          <w:sz w:val="24"/>
+          <w:szCs w:val="24"/>
+        </w:rPr>
+      </w:pPr>
+      <w:r>
+        <w:rPr>
+          <w:rFonts w:ascii="Times New Roman" w:cs="Times New Roman" w:eastAsia="Times New Roman" w:hAnsi="Times New Roman"/>
+          <w:sz w:val="24"/>
+          <w:szCs w:val="24"/>
+          <w:rtl w:val="0"/>
+        </w:rPr>
+        <w:t xml:space="preserve">4. Lämna tillbaka cykel</w:t>
+      </w:r>
+    </w:p>
+    <w:p>
+      <w:pPr>
+        <w:widowControl w:val="0"/>
+        <w:spacing w:line="240" w:lineRule="auto"/>
+        <w:rPr>
+          <w:rFonts w:ascii="Times New Roman" w:cs="Times New Roman" w:eastAsia="Times New Roman" w:hAnsi="Times New Roman"/>
+          <w:sz w:val="24"/>
+          <w:szCs w:val="24"/>
+        </w:rPr>
+      </w:pPr>
+      <w:r>
+        <w:rPr>
+          <w:rFonts w:ascii="Times New Roman" w:cs="Times New Roman" w:eastAsia="Times New Roman" w:hAnsi="Times New Roman"/>
+          <w:sz w:val="24"/>
+          <w:szCs w:val="24"/>
+          <w:rtl w:val="0"/>
+        </w:rPr>
+        <w:t xml:space="preserve">5. Ladda elcykel batteri</w:t>
+      </w:r>
+    </w:p>
+    <w:p>
+      <w:pPr>
+        <w:widowControl w:val="0"/>
+        <w:spacing w:line="240" w:lineRule="auto"/>
+        <w:rPr>
+          <w:rFonts w:ascii="Times New Roman" w:cs="Times New Roman" w:eastAsia="Times New Roman" w:hAnsi="Times New Roman"/>
+          <w:sz w:val="24"/>
+          <w:szCs w:val="24"/>
+        </w:rPr>
+      </w:pPr>
+      <w:r>
+        <w:rPr>
+          <w:rFonts w:ascii="Times New Roman" w:cs="Times New Roman" w:eastAsia="Times New Roman" w:hAnsi="Times New Roman"/>
+          <w:sz w:val="24"/>
+          <w:szCs w:val="24"/>
+          <w:rtl w:val="0"/>
+        </w:rPr>
+        <w:t xml:space="preserve">6. Avsluta</w:t>
+      </w:r>
+    </w:p>
+    <w:p>
+      <w:pPr>
+        <w:widowControl w:val="0"/>
+        <w:spacing w:line="240" w:lineRule="auto"/>
+        <w:rPr>
+          <w:rFonts w:ascii="Times New Roman" w:cs="Times New Roman" w:eastAsia="Times New Roman" w:hAnsi="Times New Roman"/>
+          <w:sz w:val="24"/>
+          <w:szCs w:val="24"/>
+        </w:rPr>
+      </w:pPr>
+      <w:r>
+        <w:rPr>
+          <w:rtl w:val="0"/>
+        </w:rPr>
+      </w:r>
+    </w:p>
+    <w:p>
+      <w:pPr>
+        <w:widowControl w:val="0"/>
+        <w:spacing w:line="240" w:lineRule="auto"/>
+        <w:rPr>
+          <w:rFonts w:ascii="Times New Roman" w:cs="Times New Roman" w:eastAsia="Times New Roman" w:hAnsi="Times New Roman"/>
+          <w:sz w:val="24"/>
+          <w:szCs w:val="24"/>
+        </w:rPr>
+      </w:pPr>
+      <w:r>
+        <w:rPr>
+          <w:rFonts w:ascii="Times New Roman" w:cs="Times New Roman" w:eastAsia="Times New Roman" w:hAnsi="Times New Roman"/>
+          <w:sz w:val="24"/>
+          <w:szCs w:val="24"/>
+          <w:rtl w:val="0"/>
+        </w:rPr>
+        <w:t xml:space="preserve">Välj ett alternativ: 4</w:t>
+      </w:r>
+    </w:p>
+    <w:p>
+      <w:pPr>
+        <w:widowControl w:val="0"/>
+        <w:spacing w:line="240" w:lineRule="auto"/>
+        <w:rPr>
+          <w:rFonts w:ascii="Times New Roman" w:cs="Times New Roman" w:eastAsia="Times New Roman" w:hAnsi="Times New Roman"/>
+          <w:sz w:val="24"/>
+          <w:szCs w:val="24"/>
+        </w:rPr>
+      </w:pPr>
+      <w:r>
+        <w:rPr>
+          <w:rFonts w:ascii="Times New Roman" w:cs="Times New Roman" w:eastAsia="Times New Roman" w:hAnsi="Times New Roman"/>
+          <w:sz w:val="24"/>
+          <w:szCs w:val="24"/>
+          <w:rtl w:val="0"/>
+        </w:rPr>
+        <w:t xml:space="preserve">Fordon som är uthyrda:</w:t>
+      </w:r>
+    </w:p>
+    <w:p>
+      <w:pPr>
+        <w:widowControl w:val="0"/>
+        <w:spacing w:line="240" w:lineRule="auto"/>
+        <w:rPr>
+          <w:rFonts w:ascii="Times New Roman" w:cs="Times New Roman" w:eastAsia="Times New Roman" w:hAnsi="Times New Roman"/>
+          <w:sz w:val="24"/>
+          <w:szCs w:val="24"/>
+        </w:rPr>
+      </w:pPr>
+      <w:r>
+        <w:rPr>
+          <w:rFonts w:ascii="Times New Roman" w:cs="Times New Roman" w:eastAsia="Times New Roman" w:hAnsi="Times New Roman"/>
+          <w:sz w:val="24"/>
+          <w:szCs w:val="24"/>
+          <w:rtl w:val="0"/>
+        </w:rPr>
+        <w:t xml:space="preserve">Cykelnummer: 3, Typ: Elcykel</w:t>
+      </w:r>
+    </w:p>
+    <w:p>
+      <w:pPr>
+        <w:widowControl w:val="0"/>
+        <w:spacing w:line="240" w:lineRule="auto"/>
+        <w:rPr>
+          <w:rFonts w:ascii="Times New Roman" w:cs="Times New Roman" w:eastAsia="Times New Roman" w:hAnsi="Times New Roman"/>
+          <w:sz w:val="24"/>
+          <w:szCs w:val="24"/>
+        </w:rPr>
+      </w:pPr>
+      <w:r>
+        <w:rPr>
+          <w:rFonts w:ascii="Times New Roman" w:cs="Times New Roman" w:eastAsia="Times New Roman" w:hAnsi="Times New Roman"/>
+          <w:sz w:val="24"/>
+          <w:szCs w:val="24"/>
+          <w:rtl w:val="0"/>
+        </w:rPr>
+        <w:t xml:space="preserve">Välj ett cykelnummer som ska lämnas in: 3</w:t>
+      </w:r>
+    </w:p>
+    <w:p>
+      <w:pPr>
+        <w:widowControl w:val="0"/>
+        <w:spacing w:line="240" w:lineRule="auto"/>
+        <w:rPr>
+          <w:rFonts w:ascii="Times New Roman" w:cs="Times New Roman" w:eastAsia="Times New Roman" w:hAnsi="Times New Roman"/>
+          <w:sz w:val="24"/>
+          <w:szCs w:val="24"/>
+        </w:rPr>
+      </w:pPr>
+      <w:r>
+        <w:rPr>
+          <w:rFonts w:ascii="Times New Roman" w:cs="Times New Roman" w:eastAsia="Times New Roman" w:hAnsi="Times New Roman"/>
+          <w:sz w:val="24"/>
+          <w:szCs w:val="24"/>
+          <w:rtl w:val="0"/>
+        </w:rPr>
+        <w:t xml:space="preserve">Cykelnummer: 0</w:t>
+      </w:r>
+    </w:p>
+    <w:p>
+      <w:pPr>
+        <w:widowControl w:val="0"/>
+        <w:spacing w:line="240" w:lineRule="auto"/>
+        <w:rPr>
+          <w:rFonts w:ascii="Times New Roman" w:cs="Times New Roman" w:eastAsia="Times New Roman" w:hAnsi="Times New Roman"/>
+          <w:sz w:val="24"/>
+          <w:szCs w:val="24"/>
+        </w:rPr>
+      </w:pPr>
+      <w:r>
+        <w:rPr>
+          <w:rFonts w:ascii="Times New Roman" w:cs="Times New Roman" w:eastAsia="Times New Roman" w:hAnsi="Times New Roman"/>
+          <w:sz w:val="24"/>
+          <w:szCs w:val="24"/>
+          <w:rtl w:val="0"/>
+        </w:rPr>
+        <w:t xml:space="preserve">KVITTO</w:t>
+      </w:r>
+    </w:p>
+    <w:p>
+      <w:pPr>
+        <w:widowControl w:val="0"/>
+        <w:spacing w:line="240" w:lineRule="auto"/>
+        <w:rPr>
+          <w:rFonts w:ascii="Times New Roman" w:cs="Times New Roman" w:eastAsia="Times New Roman" w:hAnsi="Times New Roman"/>
+          <w:sz w:val="24"/>
+          <w:szCs w:val="24"/>
+        </w:rPr>
+      </w:pPr>
+      <w:r>
+        <w:rPr>
+          <w:rFonts w:ascii="Times New Roman" w:cs="Times New Roman" w:eastAsia="Times New Roman" w:hAnsi="Times New Roman"/>
+          <w:sz w:val="24"/>
+          <w:szCs w:val="24"/>
+          <w:rtl w:val="0"/>
+        </w:rPr>
+        <w:t xml:space="preserve">Elcykel, 5 timmar * 70 kr  :  350 kr</w:t>
+      </w:r>
+    </w:p>
+    <w:p>
+      <w:pPr>
+        <w:widowControl w:val="0"/>
+        <w:spacing w:line="240" w:lineRule="auto"/>
+        <w:rPr>
+          <w:rFonts w:ascii="Times New Roman" w:cs="Times New Roman" w:eastAsia="Times New Roman" w:hAnsi="Times New Roman"/>
+          <w:sz w:val="24"/>
+          <w:szCs w:val="24"/>
+        </w:rPr>
+      </w:pPr>
+      <w:r>
+        <w:rPr>
+          <w:rFonts w:ascii="Times New Roman" w:cs="Times New Roman" w:eastAsia="Times New Roman" w:hAnsi="Times New Roman"/>
+          <w:sz w:val="24"/>
+          <w:szCs w:val="24"/>
+          <w:rtl w:val="0"/>
+        </w:rPr>
+        <w:t xml:space="preserve">Medlemsrabatt (10%)  35 kr</w:t>
+      </w:r>
+    </w:p>
+    <w:p>
+      <w:pPr>
+        <w:widowControl w:val="0"/>
+        <w:spacing w:line="240" w:lineRule="auto"/>
+        <w:rPr>
+          <w:rFonts w:ascii="Times New Roman" w:cs="Times New Roman" w:eastAsia="Times New Roman" w:hAnsi="Times New Roman"/>
+          <w:sz w:val="24"/>
+          <w:szCs w:val="24"/>
+        </w:rPr>
+      </w:pPr>
+      <w:r>
+        <w:rPr>
+          <w:rFonts w:ascii="Times New Roman" w:cs="Times New Roman" w:eastAsia="Times New Roman" w:hAnsi="Times New Roman"/>
+          <w:sz w:val="24"/>
+          <w:szCs w:val="24"/>
+          <w:rtl w:val="0"/>
+        </w:rPr>
+        <w:t xml:space="preserve">Att betala: 315 kr</w:t>
+      </w:r>
+    </w:p>
+    <w:p>
+      <w:pPr>
+        <w:widowControl w:val="0"/>
+        <w:spacing w:line="240" w:lineRule="auto"/>
+        <w:rPr>
+          <w:rFonts w:ascii="Times New Roman" w:cs="Times New Roman" w:eastAsia="Times New Roman" w:hAnsi="Times New Roman"/>
+          <w:sz w:val="24"/>
+          <w:szCs w:val="24"/>
+        </w:rPr>
+      </w:pPr>
+      <w:r>
+        <w:rPr>
+          <w:rFonts w:ascii="Times New Roman" w:cs="Times New Roman" w:eastAsia="Times New Roman" w:hAnsi="Times New Roman"/>
+          <w:sz w:val="24"/>
+          <w:szCs w:val="24"/>
+          <w:rtl w:val="0"/>
+        </w:rPr>
+        <w:t xml:space="preserve">Välkommen till Kajens Cykeluthyrning!</w:t>
+      </w:r>
+    </w:p>
+    <w:p>
+      <w:pPr>
+        <w:widowControl w:val="0"/>
+        <w:spacing w:line="240" w:lineRule="auto"/>
+        <w:rPr>
+          <w:rFonts w:ascii="Times New Roman" w:cs="Times New Roman" w:eastAsia="Times New Roman" w:hAnsi="Times New Roman"/>
+          <w:sz w:val="24"/>
+          <w:szCs w:val="24"/>
+        </w:rPr>
+      </w:pPr>
+      <w:r>
+        <w:rPr>
+          <w:rtl w:val="0"/>
+        </w:rPr>
+      </w:r>
+    </w:p>
+    <w:p>
+      <w:pPr>
+        <w:widowControl w:val="0"/>
+        <w:spacing w:line="240" w:lineRule="auto"/>
+        <w:rPr>
+          <w:rFonts w:ascii="Times New Roman" w:cs="Times New Roman" w:eastAsia="Times New Roman" w:hAnsi="Times New Roman"/>
+          <w:sz w:val="24"/>
+          <w:szCs w:val="24"/>
+        </w:rPr>
+      </w:pPr>
+      <w:r>
+        <w:rPr>
+          <w:rFonts w:ascii="Times New Roman" w:cs="Times New Roman" w:eastAsia="Times New Roman" w:hAnsi="Times New Roman"/>
+          <w:sz w:val="24"/>
+          <w:szCs w:val="24"/>
+          <w:rtl w:val="0"/>
+        </w:rPr>
+        <w:t xml:space="preserve">fixar det nu.</w:t>
+      </w:r>
+    </w:p>
+    <w:p>
+      <w:pPr>
+        <w:widowControl w:val="0"/>
+        <w:spacing w:line="240" w:lineRule="auto"/>
+        <w:rPr>
+          <w:rFonts w:ascii="Times New Roman" w:cs="Times New Roman" w:eastAsia="Times New Roman" w:hAnsi="Times New Roman"/>
+          <w:sz w:val="24"/>
+          <w:szCs w:val="24"/>
+        </w:rPr>
+      </w:pPr>
+      <w:r>
+        <w:rPr>
+          <w:rtl w:val="0"/>
+        </w:rPr>
+      </w:r>
+    </w:p>
+    <w:p>
+      <w:pPr>
+        <w:widowControl w:val="0"/>
+        <w:spacing w:line="240" w:lineRule="auto"/>
+        <w:rPr>
+          <w:rFonts w:ascii="Times New Roman" w:cs="Times New Roman" w:eastAsia="Times New Roman" w:hAnsi="Times New Roman"/>
+          <w:sz w:val="24"/>
+          <w:szCs w:val="24"/>
+        </w:rPr>
+      </w:pPr>
+      <w:r>
+        <w:rPr>
+          <w:rFonts w:ascii="Times New Roman" w:cs="Times New Roman" w:eastAsia="Times New Roman" w:hAnsi="Times New Roman"/>
+          <w:sz w:val="24"/>
+          <w:szCs w:val="24"/>
+          <w:rtl w:val="0"/>
+        </w:rPr>
+        <w:t xml:space="preserve">det e fixat. </w:t>
+      </w:r>
+    </w:p>
+    <w:p>
+      <w:pPr>
+        <w:widowControl w:val="0"/>
+        <w:spacing w:line="240" w:lineRule="auto"/>
+        <w:rPr>
+          <w:rFonts w:ascii="Times New Roman" w:cs="Times New Roman" w:eastAsia="Times New Roman" w:hAnsi="Times New Roman"/>
+          <w:sz w:val="24"/>
+          <w:szCs w:val="24"/>
+        </w:rPr>
+      </w:pPr>
+      <w:r>
+        <w:rPr>
+          <w:rtl w:val="0"/>
+        </w:rPr>
+      </w:r>
+    </w:p>
+    <w:p>
+      <w:pPr>
+        <w:widowControl w:val="0"/>
+        <w:spacing w:line="240" w:lineRule="auto"/>
+        <w:rPr>
+          <w:rFonts w:ascii="Times New Roman" w:cs="Times New Roman" w:eastAsia="Times New Roman" w:hAnsi="Times New Roman"/>
+          <w:sz w:val="24"/>
+          <w:szCs w:val="24"/>
+        </w:rPr>
+      </w:pPr>
+      <w:r>
+        <w:rPr>
+          <w:rFonts w:ascii="Times New Roman" w:cs="Times New Roman" w:eastAsia="Times New Roman" w:hAnsi="Times New Roman"/>
+          <w:sz w:val="24"/>
+          <w:szCs w:val="24"/>
+          <w:rtl w:val="0"/>
+        </w:rPr>
+        <w:t xml:space="preserve">Kom sen in på att utskriften i alternativ 5 var också fel, självklart! fixade det utan problem.</w:t>
+      </w:r>
+    </w:p>
+    <w:p>
+      <w:pPr>
+        <w:widowControl w:val="0"/>
+        <w:spacing w:line="240" w:lineRule="auto"/>
+        <w:rPr>
+          <w:rFonts w:ascii="Times New Roman" w:cs="Times New Roman" w:eastAsia="Times New Roman" w:hAnsi="Times New Roman"/>
+          <w:sz w:val="24"/>
+          <w:szCs w:val="24"/>
+        </w:rPr>
+      </w:pPr>
+      <w:r>
+        <w:rPr>
+          <w:rtl w:val="0"/>
+        </w:rPr>
+      </w:r>
+    </w:p>
+    <w:p>
+      <w:pPr>
+        <w:widowControl w:val="0"/>
+        <w:spacing w:line="240" w:lineRule="auto"/>
+        <w:rPr>
+          <w:rFonts w:ascii="Times New Roman" w:cs="Times New Roman" w:eastAsia="Times New Roman" w:hAnsi="Times New Roman"/>
+          <w:sz w:val="24"/>
+          <w:szCs w:val="24"/>
+        </w:rPr>
+      </w:pPr>
+      <w:r>
+        <w:rPr>
+          <w:rFonts w:ascii="Times New Roman" w:cs="Times New Roman" w:eastAsia="Times New Roman" w:hAnsi="Times New Roman"/>
+          <w:sz w:val="24"/>
+          <w:szCs w:val="24"/>
+          <w:rtl w:val="0"/>
+        </w:rPr>
+        <w:t xml:space="preserve">NU</w:t>
+      </w:r>
+    </w:p>
+    <w:p>
+      <w:pPr>
+        <w:widowControl w:val="0"/>
+        <w:spacing w:line="240" w:lineRule="auto"/>
+        <w:rPr>
+          <w:rFonts w:ascii="Times New Roman" w:cs="Times New Roman" w:eastAsia="Times New Roman" w:hAnsi="Times New Roman"/>
+          <w:sz w:val="24"/>
+          <w:szCs w:val="24"/>
+        </w:rPr>
+      </w:pPr>
+      <w:r>
+        <w:rPr>
+          <w:rtl w:val="0"/>
+        </w:rPr>
+      </w:r>
+    </w:p>
+    <w:p>
+      <w:pPr>
+        <w:widowControl w:val="0"/>
+        <w:spacing w:line="240" w:lineRule="auto"/>
+        <w:rPr>
+          <w:rFonts w:ascii="Times New Roman" w:cs="Times New Roman" w:eastAsia="Times New Roman" w:hAnsi="Times New Roman"/>
+          <w:sz w:val="24"/>
+          <w:szCs w:val="24"/>
+        </w:rPr>
+      </w:pPr>
+      <w:r>
+        <w:rPr>
+          <w:rFonts w:ascii="Times New Roman" w:cs="Times New Roman" w:eastAsia="Times New Roman" w:hAnsi="Times New Roman"/>
+          <w:sz w:val="24"/>
+          <w:szCs w:val="24"/>
+          <w:rtl w:val="0"/>
+        </w:rPr>
+        <w:t xml:space="preserve">Nu är uppgiften klar. Nu är bara analysen kvar.</w:t>
+      </w:r>
+    </w:p>
+    <w:p>
+      <w:pPr>
+        <w:widowControl w:val="0"/>
+        <w:spacing w:line="240" w:lineRule="auto"/>
+        <w:rPr>
+          <w:rFonts w:ascii="Times New Roman" w:cs="Times New Roman" w:eastAsia="Times New Roman" w:hAnsi="Times New Roman"/>
+          <w:sz w:val="24"/>
+          <w:szCs w:val="24"/>
+        </w:rPr>
+      </w:pPr>
+      <w:r>
+        <w:rPr>
+          <w:rtl w:val="0"/>
+        </w:rPr>
+      </w:r>
+    </w:p>
+    <w:p>
+      <w:pPr>
+        <w:widowControl w:val="0"/>
+        <w:spacing w:line="240" w:lineRule="auto"/>
+        <w:rPr>
+          <w:rFonts w:ascii="Times New Roman" w:cs="Times New Roman" w:eastAsia="Times New Roman" w:hAnsi="Times New Roman"/>
+          <w:sz w:val="24"/>
+          <w:szCs w:val="24"/>
+        </w:rPr>
+      </w:pPr>
+      <w:r>
+        <w:rPr>
+          <w:rtl w:val="0"/>
+        </w:rPr>
+      </w:r>
+    </w:p>
+    <w:p>
+      <w:pPr>
+        <w:widowControl w:val="0"/>
+        <w:spacing w:line="240" w:lineRule="auto"/>
+        <w:rPr>
+          <w:rFonts w:ascii="Times New Roman" w:cs="Times New Roman" w:eastAsia="Times New Roman" w:hAnsi="Times New Roman"/>
+          <w:sz w:val="24"/>
+          <w:szCs w:val="24"/>
+        </w:rPr>
+      </w:pPr>
       <w:r>
         <w:rPr>
           <w:rtl w:val="0"/>

</xml_diff>